<commit_message>
Add the held-out-generator result to the report
The report's real section explained the two countermeasure regimes but stopped
before the experiment that actually tests generalisation. The new paragraph gives
the leave-one-generator-out CM-EER and the fusion numbers under it, so the reader
sees that even in the most favourable condition the proposed arm stays inside the
noise band.

Co-Authored-By: Codebuff <noreply@codebuff.com>
</commit_message>
<xml_diff>
--- a/Course_Project_Report_EASV_Audited.docx
+++ b/Course_Project_Report_EASV_Audited.docx
@@ -6073,6 +6073,18 @@
           <w:sz w:val="24"/>
         </w:rPr>
         <w:t>The second regime explains why an apparent gain must be read carefully. The pretrained AASIST checkpoint, trained on ASVspoof-2019 attack families, scores at chance on these clones (SPF-EER 50.8 %). When that failing countermeasure is used, the emotion arms improve SASV-EER by about 5.5 points with p &lt; 0.001. The mechanism is not emotion conditioning: the emotion recogniser is confidently wrong on synthetic speech (30.7 % accuracy at 0.83 mean confidence, against 41.8 % on genuine speech), so its probability vector implicitly encodes whether the audio is synthetic. Emotion features act as a substitute spoof detector, which is a confound rather than the proposed effect, and it sets the agenda for the next pass: replace emotion features with an explicit confidence scalar and test whether the gain survives, and test on a held-out generator.</w:t>
+      </w:r>
+    </w:p>
+    <w:p>
+      <w:pPr>
+        <w:spacing w:after="120"/>
+      </w:pPr>
+      <w:r>
+        <w:rPr>
+          <w:rFonts w:ascii="Times New Roman" w:hAnsi="Times New Roman"/>
+          <w:sz w:val="24"/>
+        </w:rPr>
+        <w:t>A third regime tests generalisation instead of assuming it. The countermeasure was retrained with the F5-TTS generator excluded from training and from the development-based early stopping, so every F5-TTS clone is scored as an unseen attack system. That model reaches 6.27 % EER on the held-out generator (3.19 % on the generator it trained on, 4.28 % overall), against 50.8 % for the ASVspoof-pretrained AASIST: training on an adjacent neural generator transfers an order of magnitude better than the ASVspoof lineage. Under this countermeasure the fusion arms reach 4.11 % (linear), 3.81 % (interaction, +0.38 points, p &lt; 0.001) and 3.93 % (gated, +0.27 points with an interval from -0.23 to +0.86, p = 0.23) SASV-EER. The proposed arm therefore still does not clear the significance bar even in the cross-generator condition, which is the condition most favourable to its original motivation.</w:t>
       </w:r>
     </w:p>
     <w:p>

</xml_diff>

<commit_message>
Make the written record match the executed project
An audit found the code and results complete but the documentation asserting the
opposite: the report abstract still claimed no real corpus or backend existed,
section 4.1 counted 65 tests, the appendix listed only synthetic commands, and
README's "not implemented" list contradicted the rest of the file. Those are
now rewritten from the measured numbers, with the abstract carrying the actual
finding rather than a placeholder.

Also records what is genuinely open instead of implying it is done: the success
criteria were never pre-registered (PROTOCOL section 6 now says so), no
held-out-emotion split exists, the ablation overlays have only run on synthetic
data, the LA countermeasure was validated on two speakers and three epochs, the
ESD licence was never granted, and the pipeline script does not encode the
headline regime.

🤖 Generated with Codebuff
Co-Authored-By: Codebuff <noreply@codebuff.com>
</commit_message>
<xml_diff>
--- a/Course_Project_Report_EASV_Audited.docx
+++ b/Course_Project_Report_EASV_Audited.docx
@@ -584,7 +584,7 @@
           <w:color w:val="000000"/>
           <w:sz w:val="24"/>
         </w:rPr>
-        <w:t>Voice authentication is useful only when a system can distinguish a genuine claimant from an impostor and from a synthetic or replayed voice. This project develops and audits a research infrastructure for emotion-conditioned spoofing-aware speaker verification (EASV). The implementation accepts speaker-verification, countermeasure, and predicted emotion scores, validates their trial metadata, and compares five fusion models: speaker-only, conventional linear fusion, additive emotion fusion, emotion-interaction fusion, and an emotion-gated fusion model. The design protects the evaluation protocol by fitting models only on training data, selecting thresholds on development data, and reporting the held-out test split once. It also reports SASV-EER, component EERs, a-DCF, t-DCF, calibration, and grouped-bootstrap uncertainty. The repository was audited by executing its complete test suite and synthetic end-to-end demonstration. All 65 tests passed, and the demonstration generated 1,660 simulated trials with disjoint speakers, unseen test generators, and one held-out emotion. These outputs verify software behavior, not scientific performance on real speech. No real corpus, pretrained audio backend, or verified novelty comparison is included in the present repository. The report therefore presents the work as a reproducible evaluation foundation and specifies the evidence required before any real-world security or accuracy claim can be made.</w:t>
+        <w:t>Voice authentication is useful only when a system can distinguish a genuine claimant from an impostor and from a synthetic voice. This project implements, audits and executes a score-level evaluation pipeline for emotion-conditioned spoofing-aware speaker verification (EASV). The corpus combines ESD English bona fide recordings of ten speakers with 36,000 EmoSpoof-TTS clones from three neural generators (StyleTTS2, F5-TTS, CosyVoice), producing 53,900 speaker-disjoint trials. Speaker, emotion and countermeasure scores come from SpeechBrain ECAPA-TDNN, wav2vec2-base-superb-ER and a log-mel CNN; a published AASIST checkpoint and an AASIST retrained on ASVspoof 2019 LA provide the transfer controls. Fusion models are fitted on train, thresholds are selected on dev, and the test split is reported once with grouped-bootstrap intervals. Measured, the speaker front-end accepts 82.9 % of bona fide targets and 38.8 % of clones, strongly generator-dependent (CosyVoice 59.0 %, F5-TTS 51.5 %, StyleTTS2 5.9 %); conventional fusion cuts SASV-EER from 33.1 % to 0.60 % when the countermeasure works, while ASVspoof-2019 countermeasures do not transfer to these clones (50.8 % pretrained, 43.8 % retrained in-domain). On the complete corpus with StyleTTS2 held out, the countermeasure detects the unseen generator at 2.50 % EER and the proposed gated fusion is the best arm (1.54 % against 2.27 % SASV-EER, and +0.48 points over the interaction control), but its learned gate weights are flat across emotions, so the gain cannot be attributed to emotion conditioning. All 79 tests pass. The report presents these results and their limits without claiming novelty over published systems.</w:t>
       </w:r>
     </w:p>
     <w:p>
@@ -3280,7 +3280,7 @@
           <w:color w:val="000000"/>
           <w:sz w:val="24"/>
         </w:rPr>
-        <w:t>The repository was executed in its supplied virtual environment. The full automated suite completed successfully: 65 tests passed. The tests cover manifest validation, score alignment, metric direction conventions, threshold separation, fusion serialization, grouped evaluation, and command-line behaviour. Passing tests are evidence that the implemented functions meet their encoded expectations; they are not evidence that a biometric system works on unseen human speech.</w:t>
+        <w:t>The repository was executed in its supplied virtual environment. The full automated suite completed successfully: 79 tests passed. The tests cover manifest validation, score alignment, metric direction conventions, threshold separation, fusion serialization, grouped evaluation, command-line behaviour, the manifest builders, and the arm-vs-arm comparison sign convention. Passing tests are evidence that the implemented functions meet their encoded expectations; they are not evidence that a biometric system works on unseen human speech, which is why section 4.4 executes the full pipeline on real audio.</w:t>
       </w:r>
     </w:p>
     <w:p>
@@ -7129,11 +7129,17 @@
           <w:color w:val="000000"/>
           <w:sz w:val="24"/>
         </w:rPr>
-        <w:t>1. .venv/bin/python -m pytest -q  →  65 tests passed.</w:t>
+        <w:t>1. .venv/bin/python -m pytest -q  -&gt;  79 tests passed.</w:t>
         <w:br/>
-        <w:t>2. .venv/bin/python -m easv demo --out &lt;temporary directory&gt; --config configs/demo.yaml  →  1,660 synthetic trials and five fitted models.</w:t>
+        <w:t>2. .venv/bin/python -m easv demo --out &lt;temporary directory&gt; --config configs/demo.yaml  -&gt;  1,660 synthetic trials and five fitted models (pipeline smoke test only).</w:t>
         <w:br/>
-        <w:t>3. .venv/bin/python -m easv audit --manifest &lt;synthetic manifest&gt; --out &lt;temporary directory&gt;  →  0 errors and 1 intentional held-out-emotion warning.</w:t>
+        <w:t>3. .venv/bin/python -m easv audit --manifest results/e2e/merged_manifest.csv --out results/e2e/audit_real  -&gt;  0 errors, 4 expected warnings on the 53,900-trial real manifest.</w:t>
+        <w:br/>
+        <w:t>4. scripts/producer_asv.py and scripts/producer_ser.py over the merged manifest (53,900 score rows each); scripts/train_cm_indomain.py for the in-domain and StyleTTS2-held-out countermeasures; scripts/producer_cm_aasist.py for the pretrained checkpoint; scripts/train_cm_aasist_la.py plus scripts/build_manifests.py asvspoof for the LA retrain.</w:t>
+        <w:br/>
+        <w:t>5. .venv/bin/python -m easv.cli evaluate --manifest results/e2e/merged_manifest.csv --scores &lt;combined scores&gt; --config configs/real_run.yaml --out results/real/run4_3gen_crossgen  -&gt;  the three-generator tables in 4.4.</w:t>
+        <w:br/>
+        <w:t>6. .venv/bin/python scripts/compare_arms.py --results results/real/run4_3gen_crossgen --manifest results/e2e/merged_manifest.csv --a emotion_gated --b emotion_interaction  -&gt;  the arm-vs-arm contrast.</w:t>
       </w:r>
     </w:p>
     <w:p>
@@ -7170,7 +7176,7 @@
           <w:color w:val="000000"/>
           <w:sz w:val="24"/>
         </w:rPr>
-        <w:t>The synthetic demo should not be cited as a benchmark result. A real experiment needs externally sourced speech data, documented score producers, an approved protocol, and an unrepeated test evaluation. The present report intentionally preserves that distinction.</w:t>
+        <w:t>The synthetic demo should not be cited as a benchmark result. Section 4.4 is the real experiment: externally sourced speech, documented score producers, metric definitions and split rules fixed before the test report, and a test split evaluated once. (The numeric success margins were not pre-registered before the first test report; PROTOCOL section 6 records that limitation explicitly.) Its per-trial scores, fitted models and reports live in results/real/ (git-ignored because they encode corpus paths) and the audio corpora live outside the repository; docs/REAL_RESULTS.md records every number with its split, threshold policy and interval, and docs/PROGRESS_LOG.md records how the corpora were obtained. The synthetic demonstration is kept only as the pipeline smoke test.</w:t>
       </w:r>
     </w:p>
     <w:sectPr>

</xml_diff>

<commit_message>
Test the cross-emotion claim against unseen emotions
Excluding an entire emotion from both countermeasure training and the fusion
fit leaves that emotion's SASV-EER unchanged to within 0.03 points across two
folds, which closes the "never tested on an unseen emotion" objection but also
confirms the arms were hardly using emotion identity — the third independent
signal against the mechanism claim.

🤖 Generated with Codebuff
Co-Authored-By: Codebuff <noreply@codebuff.com>
</commit_message>
<xml_diff>
--- a/Course_Project_Report_EASV_Audited.docx
+++ b/Course_Project_Report_EASV_Audited.docx
@@ -3241,7 +3241,7 @@
           <w:color w:val="000000"/>
           <w:sz w:val="24"/>
         </w:rPr>
-        <w:t>The repository was executed in its supplied virtual environment. The full automated suite completed successfully: 79 tests passed. The tests cover manifest validation, score alignment, metric direction conventions, threshold separation, fusion serialization, grouped evaluation, command-line behaviour, the manifest builders, and the arm-vs-arm comparison sign convention. Passing tests are evidence that the implemented functions meet their encoded expectations; they are not evidence that a biometric system works on unseen human speech, which is why section 4.4 executes the full pipeline on real audio.</w:t>
+        <w:t>The repository was executed in its supplied virtual environment. The full automated suite completed successfully: 83 tests passed. The tests cover manifest validation, score alignment, metric direction conventions, threshold separation, fusion serialization, grouped evaluation, command-line behaviour, the manifest builders, the arm-vs-arm comparison sign convention, the SER-confidence feature mode, and the held-out-emotion fold (that it leaves the test split intact and rejects an unknown emotion). Passing tests are evidence that the implemented functions meet their encoded expectations; they are not evidence that a biometric system works on unseen human speech, which is why section 4.4 executes the full pipeline on real audio.</w:t>
       </w:r>
     </w:p>
     <w:p>
@@ -6075,7 +6075,7 @@
           <w:i w:val="0"/>
           <w:sz w:val="24"/>
         </w:rPr>
-        <w:t>The second regime explains why an apparent gain must be read carefully. The pretrained AASIST checkpoint, trained on ASVspoof-2019 attack families, scores at chance on these clones (SPF-EER 50.8 %). When that failing countermeasure is used, the emotion arms improve SASV-EER by about 5.5 points with p &lt; 0.001. The mechanism is not emotion conditioning: the emotion recogniser is confidently wrong on synthetic speech — 30.7 % accuracy at 0.83 mean confidence on the two-generator corpus, 32.8 % at 0.82 on the full three-generator corpus, against 41.2 % on genuine speech — so its probability vector implicitly encodes whether the audio is synthetic. Emotion features act as a substitute spoof detector, which is a confound rather than the proposed effect, and it sets the agenda for the next pass: replace the emotion features with an explicit confidence scalar and test whether the gain survives.</w:t>
+        <w:t>The second regime explains why an apparent gain must be read carefully. The pretrained AASIST checkpoint, trained on ASVspoof-2019 attack families, scores at chance on these clones (SPF-EER 50.8 %). When that failing countermeasure is used, the emotion arms improve SASV-EER by about 5.5 points with p &lt; 0.001. The mechanism is not emotion conditioning: the emotion recogniser is confidently wrong on synthetic speech — 30.7 % accuracy at 0.83 mean confidence on the two-generator corpus, 32.8 % at 0.82 on the full three-generator corpus, against 41.2 % on genuine speech — so its probability vector implicitly encodes whether the audio is synthetic. Emotion features act as a substitute spoof detector, which is a confound rather than the proposed effect. That was tested directly: replacing the four-way emotion vector with the single maximum predicted probability, while keeping the fusion ladder identical, recovers +1.6 of the +5.4 points (95 % CI 0.70-2.74, p &lt; 0.001) on this regime, and the full vector remains significantly better than that scalar (−3.7 points, CI −7.68 to −0.78). Roughly a third of the apparent gain is therefore a spoof cue, and the remainder is the per-class structure of an out-of-domain emotion output rather than demonstrated emotion semantics. In the three-generator regime the same ablation is decisive against the mechanism: the gated arm reaches 1.49 % with the scalar alone against 1.54 % with the full vector, a difference of 0.02 points whose interval spans zero (p = 0.76), so its advantage does not require emotion information at all.</w:t>
       </w:r>
     </w:p>
     <w:p>
@@ -6124,6 +6124,18 @@
           <w:sz w:val="24"/>
         </w:rPr>
         <w:t>Finally, the ASVspoof 2019 LA training set (16,000 utterances, 2,576 held out by speaker) was used to retrain the published AASIST architecture in-domain, so that the countermeasure's failure could not be blamed on a missing checkpoint. The selected model reaches 2.11 % EER on held-out LA speakers, i.e. it is a working LA countermeasure, yet it scores 43.82 % SPF-EER on the EASV test split (49.37 % on dev). The negative transfer result therefore does not depend on which LA checkpoint is used: ASVspoof-2019 supervision, in either form, does not describe these neural clones, while a log-mel countermeasure trained on two adjacent generators detects the third at 2.50 % EER.</w:t>
+      </w:r>
+    </w:p>
+    <w:p>
+      <w:pPr>
+        <w:spacing w:after="120"/>
+      </w:pPr>
+      <w:r>
+        <w:rPr>
+          <w:rFonts w:ascii="Times New Roman" w:hAnsi="Times New Roman"/>
+          <w:sz w:val="24"/>
+        </w:rPr>
+        <w:t>Two further folds test the cross-emotion claim directly. In each, one emotion (angry, then neutral) is removed from every stage that could learn it: the countermeasure's training and development-based early stopping, and the fusion fit's train and dev splits, while the test split is left intact, so the held-out trials are scored by a pipeline that never encountered that emotion. Removing it costs nothing. The countermeasure detects the held-out emotion at 0.03 % EER (0.08 % overall), and on that emotion's 5,040 test trials the largest change in SASV-EER between fitting with and without it is 0.03 points, with every paired bootstrap interval containing zero (gated, angry: −0.01 points, interval −0.06 to 0.00; gated, neutral: +0.03, interval 0.00 to 0.13). The pipeline therefore generalises to an emotion it has never seen. The reason is not that the emotion features generalise well but that they carry little emotion-specific structure: an arm that genuinely conditioned on emotion would lose something when an entire condition is removed, and these lose nothing measurable. That is the third independent line of evidence against the mechanism, alongside the flat gate weights and the confidence-scalar reproduction.</w:t>
       </w:r>
     </w:p>
     <w:p>
@@ -6251,7 +6263,7 @@
           <w:color w:val="000000"/>
           <w:sz w:val="24"/>
         </w:rPr>
-        <w:t>The synthetic run provides no basis for claiming real authentication gains, and the real runs give a mixed verdict that is reported as measured. On the held-out test split, plain fusion cut SASV-EER from 33.1 % to 0.60 % when the countermeasure worked, which is a genuine security improvement over ASV alone, while the proposed arm was slightly worse there. On the complete three-generator corpus with a countermeasure that has never seen the third generator, the proposed arm is the best model (1.54 % against 2.27 % for plain fusion), significantly so over both the interaction control (+0.48 points) and the capacity control (+0.85 points), but its gate weights do not vary with emotion. The defensible claim is therefore narrower than the original hypothesis: emotion-conditioned architecture choices can improve spoofing-aware fusion on a hard, cross-generator corpus, but this data does not show that the improvement comes from using emotion. The failure of ASVspoof-2019 countermeasures to transfer to modern neural clones (50.8 % EER pretrained, 43.8 % retrained in-domain) is arguably the most useful finding, because it shows that countermeasure generalisation, not fusion architecture, is the binding constraint.</w:t>
+        <w:t>The synthetic run provides no basis for claiming real authentication gains, and the real runs give a mixed verdict that is reported as measured. On the held-out test split, plain fusion cut SASV-EER from 33.1 % to 0.60 % when the countermeasure worked, which is a genuine security improvement over ASV alone, while the proposed arm was slightly worse there. On the complete three-generator corpus with a countermeasure that has never seen the third generator, the proposed arm is the best model (1.54 % against 2.27 % for plain fusion), significantly so over both the interaction control (+0.48 points) and the capacity control (+0.85 points), but its gate weights do not vary with emotion. The defensible claim is therefore narrower than the original hypothesis: emotion-conditioned architecture choices can improve spoofing-aware fusion on a hard, cross-generator corpus, but this data does not show that the improvement comes from using emotion. The held-out-emotion folds remove the last alternative reading: excluding an entire emotion from the countermeasure's training and from the fusion fit leaves that emotion's error rate unchanged to within 0.03 points, so the pipeline is not relying on memorised emotion identities either, and it loses nothing because it was hardly using them. The failure of ASVspoof-2019 countermeasures to transfer to modern neural clones (50.8 % EER pretrained, 43.8 % retrained in-domain) is arguably the most useful finding, because it shows that countermeasure generalisation, not fusion architecture, is the binding constraint.</w:t>
       </w:r>
     </w:p>
     <w:p>
@@ -6289,7 +6301,7 @@
           <w:color w:val="000000"/>
           <w:sz w:val="24"/>
         </w:rPr>
-        <w:t>Future work should close what this study leaves open: a held-out-emotion split, since every emotion condition here appears in training; a pre-registered decision table, because the success margins were recorded only after the test report; the two ablation overlays on real data; repeated seeds and a second speaker split; reproduction of a published baseline under a matched protocol, which would also validate the metric code against reference numbers; and the ASVspoof 2019 evaluation partition, which would give the retrained countermeasure a standard benchmark instead of two held-out speakers. The ESD research licence also has to be settled before publication. These steps will determine whether the gating advantage survives, is limited to the cross-generator condition, or is an artefact of capacity and calibration.</w:t>
+        <w:t>Future work should close what this study leaves open: a held-out-emotion fold against a failing countermeasure, since the two folds reported here were run only where the countermeasure already works; a pre-registered decision table, because the success margins were recorded only after the test report; the two ablation overlays on real data; repeated seeds and a second speaker split; reproduction of a published baseline under a matched protocol, which would also validate the metric code against reference numbers; and the ASVspoof 2019 evaluation partition, which would give the retrained countermeasure a standard benchmark instead of two held-out speakers. The ESD research licence also has to be settled before publication. The evidence gathered so far already points to the third of the original alternatives: the gating advantage is limited to the cross-generator corpus and is explained by capacity and calibration rather than by emotion conditioning.</w:t>
       </w:r>
     </w:p>
     <w:p>
@@ -7090,7 +7102,7 @@
           <w:color w:val="000000"/>
           <w:sz w:val="24"/>
         </w:rPr>
-        <w:t>1. .venv/bin/python -m pytest -q  -&gt;  79 tests passed.</w:t>
+        <w:t>1. .venv/bin/python -m pytest -q  -&gt;  83 tests passed.</w:t>
         <w:br/>
         <w:t>2. .venv/bin/python -m easv demo --out &lt;temporary directory&gt; --config configs/demo.yaml  -&gt;  1,660 synthetic trials and five fitted models (pipeline smoke test only).</w:t>
         <w:br/>
@@ -7101,6 +7113,8 @@
         <w:t>5. .venv/bin/python -m easv.cli evaluate --manifest results/e2e/merged_manifest.csv --scores &lt;combined scores&gt; --config configs/real_run.yaml --out results/real/run4_3gen_crossgen  -&gt;  the three-generator tables in 4.4.</w:t>
         <w:br/>
         <w:t>6. .venv/bin/python scripts/compare_arms.py --results results/real/run4_3gen_crossgen --manifest results/e2e/merged_manifest.csv --a emotion_gated --b emotion_interaction  -&gt;  the arm-vs-arm contrast.</w:t>
+        <w:br/>
+        <w:t>7. scripts/train_cm_indomain.py --holdout-emotion &lt;angry|neutral&gt;, then easv.cli evaluate with and without --set folds.holdout_emotion=&lt;emotion&gt;, then scripts/compare_arms.py --emotion &lt;emotion&gt;  -&gt;  the held-out-emotion folds.</w:t>
       </w:r>
     </w:p>
     <w:p>

</xml_diff>

<commit_message>
Generate the figure set from stored results
The five manuscript figures are now produced by a script from the evaluation
output rather than hand-drawn, which also caught an inverted DET curve: the
curve helper reported the accept count as the rejection rate, and the fixed
version reproduces every reported SASV-EER at its crossing.

🤖 Generated with Codebuff
Co-Authored-By: Codebuff <noreply@codebuff.com>
</commit_message>
<xml_diff>
--- a/Course_Project_Report_EASV_Audited.docx
+++ b/Course_Project_Report_EASV_Audited.docx
@@ -3241,7 +3241,7 @@
           <w:color w:val="000000"/>
           <w:sz w:val="24"/>
         </w:rPr>
-        <w:t>The repository was executed in its supplied virtual environment. The full automated suite completed successfully: 83 tests passed. The tests cover manifest validation, score alignment, metric direction conventions, threshold separation, fusion serialization, grouped evaluation, command-line behaviour, the manifest builders, the arm-vs-arm comparison sign convention, the SER-confidence feature mode, and the held-out-emotion fold (that it leaves the test split intact and rejects an unknown emotion). Passing tests are evidence that the implemented functions meet their encoded expectations; they are not evidence that a biometric system works on unseen human speech, which is why section 4.4 executes the full pipeline on real audio.</w:t>
+        <w:t>The repository was executed in its supplied virtual environment. The full automated suite completed successfully: 85 tests passed. The tests cover manifest validation, score alignment, metric direction conventions, threshold separation, fusion serialization, grouped evaluation, command-line behaviour, the manifest builders, the arm-vs-arm comparison sign convention, the SER-confidence feature mode, and the held-out-emotion fold (that it leaves the test split intact and rejects an unknown emotion). Passing tests are evidence that the implemented functions meet their encoded expectations; they are not evidence that a biometric system works on unseen human speech, which is why section 4.4 executes the full pipeline on real audio.</w:t>
       </w:r>
     </w:p>
     <w:p>
@@ -7102,7 +7102,7 @@
           <w:color w:val="000000"/>
           <w:sz w:val="24"/>
         </w:rPr>
-        <w:t>1. .venv/bin/python -m pytest -q  -&gt;  83 tests passed.</w:t>
+        <w:t>1. .venv/bin/python -m pytest -q  -&gt;  85 tests passed.</w:t>
         <w:br/>
         <w:t>2. .venv/bin/python -m easv demo --out &lt;temporary directory&gt; --config configs/demo.yaml  -&gt;  1,660 synthetic trials and five fitted models (pipeline smoke test only).</w:t>
         <w:br/>

</xml_diff>

<commit_message>
Re-anchor the journal track on CREMA-D and add its manifest builder
CREMA-D is ODbL 1.0 with no request or signature needed, so the pending-licence
shadow disappears instead of being footnoted, and its 91 actors replace the four
evaluation speakers every confidence interval currently rests on.

🤖 Generated with Codebuff
Co-Authored-By: Codebuff <noreply@codebuff.com>
</commit_message>
<xml_diff>
--- a/Course_Project_Report_EASV_Audited.docx
+++ b/Course_Project_Report_EASV_Audited.docx
@@ -3241,7 +3241,7 @@
           <w:color w:val="000000"/>
           <w:sz w:val="24"/>
         </w:rPr>
-        <w:t>The repository was executed in its supplied virtual environment. The full automated suite completed successfully: 85 tests passed. The tests cover manifest validation, score alignment, metric direction conventions, threshold separation, fusion serialization, grouped evaluation, command-line behaviour, the manifest builders, the arm-vs-arm comparison sign convention, the SER-confidence feature mode, and the held-out-emotion fold (that it leaves the test split intact and rejects an unknown emotion). Passing tests are evidence that the implemented functions meet their encoded expectations; they are not evidence that a biometric system works on unseen human speech, which is why section 4.4 executes the full pipeline on real audio.</w:t>
+        <w:t>The repository was executed in its supplied virtual environment. The full automated suite completed successfully: 88 tests passed. The tests cover manifest validation, score alignment, metric direction conventions, threshold separation, fusion serialization, grouped evaluation, command-line behaviour, the manifest builders, the arm-vs-arm comparison sign convention, the SER-confidence feature mode, and the held-out-emotion fold (that it leaves the test split intact and rejects an unknown emotion). Passing tests are evidence that the implemented functions meet their encoded expectations; they are not evidence that a biometric system works on unseen human speech, which is why section 4.4 executes the full pipeline on real audio.</w:t>
       </w:r>
     </w:p>
     <w:p>
@@ -7102,7 +7102,7 @@
           <w:color w:val="000000"/>
           <w:sz w:val="24"/>
         </w:rPr>
-        <w:t>1. .venv/bin/python -m pytest -q  -&gt;  85 tests passed.</w:t>
+        <w:t>1. .venv/bin/python -m pytest -q  -&gt;  88 tests passed.</w:t>
         <w:br/>
         <w:t>2. .venv/bin/python -m easv demo --out &lt;temporary directory&gt; --config configs/demo.yaml  -&gt;  1,660 synthetic trials and five fitted models (pipeline smoke test only).</w:t>
         <w:br/>

</xml_diff>

<commit_message>
Scaffold CREMA-D clone generation and its quality gate
The journal corpus depends on a regeneration step that can be wasted, so the
planner, the resumable runner and the pass/fail gate now exist and are tested
against fixtures; only the corpus and a TTS command remain to be supplied.

🤖 Generated with Codebuff
Co-Authored-By: Codebuff <noreply@codebuff.com>
</commit_message>
<xml_diff>
--- a/Course_Project_Report_EASV_Audited.docx
+++ b/Course_Project_Report_EASV_Audited.docx
@@ -3241,7 +3241,7 @@
           <w:color w:val="000000"/>
           <w:sz w:val="24"/>
         </w:rPr>
-        <w:t>The repository was executed in its supplied virtual environment. The full automated suite completed successfully: 88 tests passed. The tests cover manifest validation, score alignment, metric direction conventions, threshold separation, fusion serialization, grouped evaluation, command-line behaviour, the manifest builders, the arm-vs-arm comparison sign convention, the SER-confidence feature mode, and the held-out-emotion fold (that it leaves the test split intact and rejects an unknown emotion). Passing tests are evidence that the implemented functions meet their encoded expectations; they are not evidence that a biometric system works on unseen human speech, which is why section 4.4 executes the full pipeline on real audio.</w:t>
+        <w:t>The repository was executed in its supplied virtual environment. The full automated suite completed successfully: 95 tests passed. The tests cover manifest validation, score alignment, metric direction conventions, threshold separation, fusion serialization, grouped evaluation, command-line behaviour, the manifest builders, the arm-vs-arm comparison sign convention, the SER-confidence feature mode, and the held-out-emotion fold (that it leaves the test split intact and rejects an unknown emotion). Passing tests are evidence that the implemented functions meet their encoded expectations; they are not evidence that a biometric system works on unseen human speech, which is why section 4.4 executes the full pipeline on real audio.</w:t>
       </w:r>
     </w:p>
     <w:p>
@@ -7102,7 +7102,7 @@
           <w:color w:val="000000"/>
           <w:sz w:val="24"/>
         </w:rPr>
-        <w:t>1. .venv/bin/python -m pytest -q  -&gt;  88 tests passed.</w:t>
+        <w:t>1. .venv/bin/python -m pytest -q  -&gt;  95 tests passed.</w:t>
         <w:br/>
         <w:t>2. .venv/bin/python -m easv demo --out &lt;temporary directory&gt; --config configs/demo.yaml  -&gt;  1,660 synthetic trials and five fitted models (pipeline smoke test only).</w:t>
         <w:br/>

</xml_diff>

<commit_message>
Close the clone loop with a manifest builder and a generic merge
Generated clones now become trials: each inherits its source clip's split rather
than computing one, and the merge derives the authoritative split from target rows
instead of hardcoding the ESD corpus name, so CREMA-D needs no special case.

🤖 Generated with Codebuff
Co-Authored-By: Codebuff <noreply@codebuff.com>
</commit_message>
<xml_diff>
--- a/Course_Project_Report_EASV_Audited.docx
+++ b/Course_Project_Report_EASV_Audited.docx
@@ -3241,7 +3241,7 @@
           <w:color w:val="000000"/>
           <w:sz w:val="24"/>
         </w:rPr>
-        <w:t>The repository was executed in its supplied virtual environment. The full automated suite completed successfully: 95 tests passed. The tests cover manifest validation, score alignment, metric direction conventions, threshold separation, fusion serialization, grouped evaluation, command-line behaviour, the manifest builders, the arm-vs-arm comparison sign convention, the SER-confidence feature mode, and the held-out-emotion fold (that it leaves the test split intact and rejects an unknown emotion). Passing tests are evidence that the implemented functions meet their encoded expectations; they are not evidence that a biometric system works on unseen human speech, which is why section 4.4 executes the full pipeline on real audio.</w:t>
+        <w:t>The repository was executed in its supplied virtual environment. The full automated suite completed successfully: 97 tests passed. The tests cover manifest validation, score alignment, metric direction conventions, threshold separation, fusion serialization, grouped evaluation, command-line behaviour, the manifest builders, the arm-vs-arm comparison sign convention, the SER-confidence feature mode, and the held-out-emotion fold (that it leaves the test split intact and rejects an unknown emotion). Passing tests are evidence that the implemented functions meet their encoded expectations; they are not evidence that a biometric system works on unseen human speech, which is why section 4.4 executes the full pipeline on real audio.</w:t>
       </w:r>
     </w:p>
     <w:p>
@@ -7102,7 +7102,7 @@
           <w:color w:val="000000"/>
           <w:sz w:val="24"/>
         </w:rPr>
-        <w:t>1. .venv/bin/python -m pytest -q  -&gt;  95 tests passed.</w:t>
+        <w:t>1. .venv/bin/python -m pytest -q  -&gt;  97 tests passed.</w:t>
         <w:br/>
         <w:t>2. .venv/bin/python -m easv demo --out &lt;temporary directory&gt; --config configs/demo.yaml  -&gt;  1,660 synthetic trials and five fitted models (pipeline smoke test only).</w:t>
         <w:br/>

</xml_diff>